<commit_message>
[UPD] apc: classes part I
</commit_message>
<xml_diff>
--- a/Italiano/Italian Notes.docx
+++ b/Italiano/Italian Notes.docx
@@ -2371,15 +2371,7 @@
       </w:pPr>
     </w:p>
     <w:p>
-      <w:pPr>
-        <w:rPr>
-          <w:lang w:val="en-US"/>
-        </w:rPr>
-      </w:pPr>
-      <w:r>
-        <w:rPr>
-          <w:lang w:val="en-US"/>
-        </w:rPr>
+      <w:r>
         <w:t>Pagina 50 ejercicios mirar pdf</w:t>
       </w:r>
     </w:p>
@@ -2388,14 +2380,8 @@
         <w:pBdr>
           <w:bottom w:val="single" w:sz="12" w:space="1" w:color="auto"/>
         </w:pBdr>
-        <w:rPr>
-          <w:lang w:val="en-US"/>
-        </w:rPr>
       </w:pPr>
       <w:r>
-        <w:rPr>
-          <w:lang w:val="en-US"/>
-        </w:rPr>
         <w:t xml:space="preserve"> </w:t>
       </w:r>
     </w:p>
@@ -2404,14 +2390,8 @@
         <w:pBdr>
           <w:bottom w:val="single" w:sz="12" w:space="1" w:color="auto"/>
         </w:pBdr>
-        <w:rPr>
-          <w:lang w:val="en-US"/>
-        </w:rPr>
       </w:pPr>
       <w:r>
-        <w:rPr>
-          <w:lang w:val="en-US"/>
-        </w:rPr>
         <w:t>Homerwork for giovendi</w:t>
       </w:r>
     </w:p>
@@ -2423,6 +2403,7 @@
       </w:pPr>
       <w:r>
         <w:rPr>
+          <w:noProof/>
           <w:lang w:val="en-US"/>
         </w:rPr>
         <w:lastRenderedPageBreak/>
@@ -2464,6 +2445,15 @@
       </w:r>
     </w:p>
     <w:p>
+      <w:r>
+        <w:t>14</w:t>
+      </w:r>
+      <w:r>
+        <w:t xml:space="preserve">  1- davanti ; 2- tra;3-vicino;4-soto;5-sul;6-sui ; 7-sopra; 8- a destra;</w:t>
+      </w:r>
+    </w:p>
+    <w:p/>
+    <w:p>
       <w:pPr>
         <w:rPr>
           <w:lang w:val="en-US"/>
@@ -2471,6 +2461,7 @@
       </w:pPr>
       <w:r>
         <w:rPr>
+          <w:noProof/>
           <w:lang w:val="en-US"/>
         </w:rPr>
         <w:drawing>
@@ -2512,10 +2503,53 @@
     </w:p>
     <w:p>
       <w:r>
+        <w:t xml:space="preserve">15 - </w:t>
+      </w:r>
+      <w:r>
         <w:t>1 ci sono; 2 c’e ; 3 ci sono;</w:t>
       </w:r>
       <w:r>
         <w:t xml:space="preserve"> 4 c’e – ci sono; 5 ci sono; 6 c’e ; 7 c’e ; 8 c’e</w:t>
+      </w:r>
+    </w:p>
+    <w:p/>
+    <w:p>
+      <w:r>
+        <w:drawing>
+          <wp:inline distT="0" distB="0" distL="0" distR="0" wp14:anchorId="12979CCF" wp14:editId="61DEBA68">
+            <wp:extent cx="4915586" cy="1247949"/>
+            <wp:effectExtent l="0" t="0" r="0" b="9525"/>
+            <wp:docPr id="456859900" name="Picture 1" descr="A screenshot of a phone&#10;&#10;AI-generated content may be incorrect."/>
+            <wp:cNvGraphicFramePr>
+              <a:graphicFrameLocks xmlns:a="http://schemas.openxmlformats.org/drawingml/2006/main" noChangeAspect="1"/>
+            </wp:cNvGraphicFramePr>
+            <a:graphic xmlns:a="http://schemas.openxmlformats.org/drawingml/2006/main">
+              <a:graphicData uri="http://schemas.openxmlformats.org/drawingml/2006/picture">
+                <pic:pic xmlns:pic="http://schemas.openxmlformats.org/drawingml/2006/picture">
+                  <pic:nvPicPr>
+                    <pic:cNvPr id="456859900" name="Picture 1" descr="A screenshot of a phone&#10;&#10;AI-generated content may be incorrect."/>
+                    <pic:cNvPicPr/>
+                  </pic:nvPicPr>
+                  <pic:blipFill>
+                    <a:blip r:embed="rId86"/>
+                    <a:stretch>
+                      <a:fillRect/>
+                    </a:stretch>
+                  </pic:blipFill>
+                  <pic:spPr>
+                    <a:xfrm>
+                      <a:off x="0" y="0"/>
+                      <a:ext cx="4915586" cy="1247949"/>
+                    </a:xfrm>
+                    <a:prstGeom prst="rect">
+                      <a:avLst/>
+                    </a:prstGeom>
+                  </pic:spPr>
+                </pic:pic>
+              </a:graphicData>
+            </a:graphic>
+          </wp:inline>
+        </w:drawing>
       </w:r>
     </w:p>
     <w:sectPr>
@@ -3600,7 +3634,7 @@
   </inkml:definitions>
   <inkml:trace contextRef="#ctx0" brushRef="#br0">78 499 24575,'-3'2'0,"-1"0"0,1 1 0,0 0 0,0-1 0,1 1 0,-1 0 0,1 0 0,-1 1 0,1-1 0,0 0 0,0 1 0,0 0 0,1-1 0,-2 5 0,-2 1 0,0 1 0,0 1 0,0-1 0,1 1 0,0 0 0,0-1 0,-2 21 0,5-29 0,1 0 0,0 0 0,0 0 0,0 0 0,0 1 0,0-1 0,0 0 0,1 0 0,-1 0 0,0 0 0,1 0 0,0 0 0,0 0 0,-1 0 0,1 0 0,0 0 0,1 0 0,-1 0 0,0-1 0,0 1 0,1 0 0,-1-1 0,1 1 0,-1-1 0,1 0 0,0 1 0,0-1 0,0 0 0,-1 0 0,1 0 0,0 0 0,0 0 0,0-1 0,0 1 0,0-1 0,1 1 0,-1-1 0,0 0 0,0 0 0,0 0 0,4 0 0,3 1 0,1-1 0,-1 0 0,0 0 0,1-1 0,-1 0 0,16-4 0,-22 3 0,0 1 0,0 0 0,0-1 0,0 0 0,-1 0 0,1 0 0,-1 0 0,1 0 0,-1 0 0,0-1 0,0 1 0,0-1 0,0 0 0,0 1 0,-1-1 0,1 0 0,-1 0 0,0 0 0,0 0 0,0 0 0,0 0 0,1-6 0,-1 3-65,0 0 0,0-1 0,0 1 0,-1 0 0,0-1 0,0 1 0,0 0 0,-1-1 0,0 1 0,0 0 0,-1 0 0,0-1 0,0 1 0,0 1 0,-1-1 0,0 0 0,0 0 0,0 1 0,-1 0 0,-7-9 0,-1 5-6761</inkml:trace>
   <inkml:trace contextRef="#ctx0" brushRef="#br0" timeOffset="1015.1">306 516 24575,'6'8'0,"0"0"0,0 1 0,0 0 0,-1 0 0,-1 0 0,0 0 0,0 1 0,0-1 0,2 13 0,15 95 0,-18-96 0,-6-64 0,4-47 0,1 20 0,-2 64-68,1 1 0,0 0-1,0 0 1,0 0 0,1 1 0,0-1-1,-1 0 1,2 0 0,-1 1 0,0-1-1,1 1 1,0 0 0,0 0 0,0 0-1,1 0 1,0 0 0,-1 1-1,1 0 1,5-4 0,8-5-6758</inkml:trace>
-  <inkml:trace contextRef="#ctx0" brushRef="#br0" timeOffset="1599.17">874 156 24575,'3'9'0,"2"7"0,-1 4 0,-1 5 0,-1 4 0,0 8 0,-1 3 0,-1 5 0,0-3 0,0-1 0,0-4 0,0-3 0,-1-3 0,1-5 0,0-2 0,0-3 0,0-1 0,0-5-8191</inkml:trace>
+  <inkml:trace contextRef="#ctx0" brushRef="#br0" timeOffset="1599.16">874 156 24575,'3'9'0,"2"7"0,-1 4 0,-1 5 0,-1 4 0,0 8 0,-1 3 0,-1 5 0,0-3 0,0-1 0,0-4 0,0-3 0,-1-3 0,1-5 0,0-2 0,0-3 0,0-1 0,0-5-8191</inkml:trace>
   <inkml:trace contextRef="#ctx0" brushRef="#br0" timeOffset="2247.56">571 554 24575,'2'-2'0,"1"0"0,-1 1 0,1-1 0,-1 0 0,1 1 0,0-1 0,0 1 0,-1 0 0,1 0 0,0 0 0,0 0 0,0 1 0,0-1 0,6 1 0,0-2 0,42-11-119,219-46-1127,-252 57-5580</inkml:trace>
   <inkml:trace contextRef="#ctx0" brushRef="#br0" timeOffset="3688.89">1347 478 24575,'-2'4'0,"-1"-1"0,0 1 0,0-1 0,0 0 0,0 0 0,-1-1 0,1 1 0,-1-1 0,1 1 0,-6 2 0,-8 5 0,9-1 0,-1 0 0,1 0 0,0 0 0,1 1 0,-7 13 0,12-21 0,0 1 0,0 1 0,0-1 0,1 0 0,-1 0 0,1 1 0,0-1 0,0 1 0,0-1 0,0 1 0,1-1 0,-1 1 0,1-1 0,0 1 0,0 0 0,0-1 0,1 1 0,-1-1 0,1 1 0,0-1 0,2 6 0,-2-7 0,1-1 0,-1 1 0,0 0 0,1-1 0,0 0 0,-1 1 0,1-1 0,0 0 0,0 0 0,0 0 0,0 0 0,0 0 0,0 0 0,0 0 0,0-1 0,0 1 0,0-1 0,0 0 0,0 1 0,0-1 0,1 0 0,-1 0 0,0 0 0,0-1 0,0 1 0,0 0 0,3-2 0,-3 2 0,1-1 0,-1 0 0,1 0 0,-1 0 0,1 0 0,-1 0 0,1 0 0,-1-1 0,0 1 0,0-1 0,0 1 0,0-1 0,0 0 0,0 0 0,0 0 0,-1 0 0,1 0 0,-1-1 0,1 1 0,-1 0 0,2-5 0,-1-4 0,-1 0 0,-1 0 0,0 0 0,0 0 0,-1 0 0,0 0 0,-1 0 0,-4-15 0,3 12 0,0-1 0,1 0 0,0-24 0,2 39 0,-1-1 0,1 1 0,0 0 0,0 0 0,0 0 0,0 0 0,0 0 0,0 0 0,0-1 0,0 1 0,0 0 0,0 0 0,0 0 0,0 0 0,0 0 0,0-1 0,0 1 0,0 0 0,0 0 0,0 0 0,0 0 0,0 0 0,0-1 0,0 1 0,0 0 0,0 0 0,0 0 0,1 0 0,-1 0 0,0 0 0,0-1 0,0 1 0,0 0 0,0 0 0,0 0 0,0 0 0,0 0 0,1 0 0,-1 0 0,0 0 0,0 0 0,0 0 0,0-1 0,0 1 0,0 0 0,1 0 0,-1 0 0,0 0 0,0 0 0,0 0 0,0 0 0,0 0 0,1 0 0,-1 0 0,0 0 0,0 0 0,0 0 0,0 1 0,0-1 0,1 0 0,-1 0 0,0 0 0,9 12 0,6 17 0,-6-5-119,-5-10 6,0-1-1,1 1 1,1-1 0,0 0 0,1-1-1,0 0 1,1 0 0,1 0 0,0-1-1,12 12 1,-4-11-6713</inkml:trace>
   <inkml:trace contextRef="#ctx0" brushRef="#br0" timeOffset="5025.45">1462 403 24575,'4'-3'0,"4"9"0,6 11 0,8 43 0,-18-44 0,2 0 0,14 28 0,-18-72 0,-4-17 0,0 32 0,2-1 0,-1 1 0,2 0 0,0 0 0,0 0 0,5-16 0,-5 25 0,1 0 0,-1 0 0,1 0 0,0 0 0,0 1 0,1-1 0,-1 1 0,1-1 0,0 1 0,0 0 0,0 0 0,0 0 0,0 1 0,1-1 0,-1 1 0,1-1 0,-1 1 0,1 0 0,0 1 0,0-1 0,0 1 0,0 0 0,5-1 0,-2 0 8,0 0-1,0 1 1,0 0-1,0 0 1,0 0-1,0 1 1,0 0-1,0 1 1,0 0-1,0 0 1,0 0-1,0 1 1,-1 0-1,1 0 1,9 5-1,-11-4-81,-1 1-1,1-1 1,-1 1 0,0 0 0,0 0-1,0 0 1,-1 0 0,1 1 0,-1-1-1,0 1 1,0 0 0,-1 0 0,1 0-1,-1 1 1,0-1 0,-1 0 0,1 1-1,-1-1 1,1 9 0,0 3-6752</inkml:trace>
@@ -3780,7 +3814,7 @@
     </inkml:brush>
   </inkml:definitions>
   <inkml:trace contextRef="#ctx0" brushRef="#br0">138 34 24575,'-1'7'0,"-1"-1"0,0-1 0,-1 1 0,1 0 0,-1 0 0,0-1 0,-1 0 0,1 1 0,-1-1 0,-8 7 0,1 3 0,1-2 0,-2 3 0,0 0 0,1 1 0,1 0 0,0 1 0,-10 27 0,20-44 0,-1 0 0,1 0 0,0 0 0,-1-1 0,1 1 0,0 0 0,0 0 0,0 0 0,0 0 0,0 0 0,0 0 0,0 0 0,0 0 0,0 0 0,0 0 0,1 0 0,-1 0 0,0 0 0,1-1 0,-1 1 0,0 0 0,1 0 0,-1 0 0,1-1 0,0 1 0,-1 0 0,1 0 0,0-1 0,-1 1 0,2 1 0,1-1 0,0 0 0,-1 0 0,1-1 0,-1 1 0,1 0 0,0-1 0,0 0 0,-1 1 0,1-1 0,5-1 0,9-1 0,0-1 0,26-7 0,-39 9 0,84-22-1365,-68 19-5461</inkml:trace>
-  <inkml:trace contextRef="#ctx0" brushRef="#br0" timeOffset="647.83">171 0 24575,'0'3'0,"0"9"0,0 9 0,3 8 0,6 8 0,5 4 0,0 3 0,0 2 0,1 5 0,0-1 0,1 0 0,0-4 0,1-3 0,-4-4 0,-2-5 0,-5-4 0,-2-6-8191</inkml:trace>
+  <inkml:trace contextRef="#ctx0" brushRef="#br0" timeOffset="647.82">171 0 24575,'0'3'0,"0"9"0,0 9 0,3 8 0,6 8 0,5 4 0,0 3 0,0 2 0,1 5 0,0-1 0,1 0 0,0-4 0,1-3 0,-4-4 0,-2-5 0,-5-4 0,-2-6-8191</inkml:trace>
 </inkml:ink>
 </file>
 
@@ -3809,7 +3843,7 @@
     </inkml:brush>
   </inkml:definitions>
   <inkml:trace contextRef="#ctx0" brushRef="#br0">138 32 24575,'-7'10'0,"-1"0"0,1 0 0,-10 21 0,4-9 0,-19 27 0,20-33 0,1 2 0,-18 34 0,29-51 8,0 0-1,0 0 0,-1 0 0,1 0 1,0 0-1,0 0 0,0 0 0,0 0 1,0 0-1,0 0 0,0 0 0,0 0 1,1 0-1,-1 0 0,0 0 0,0 0 1,1 0-1,-1 0 0,1 0 0,-1-1 1,1 1-1,-1 0 0,1 0 1,0 0-1,-1-1 0,1 1 0,0 0 1,-1-1-1,1 1 0,0 0 0,0-1 1,0 1-1,0-1 0,0 1 0,-1-1 1,1 0-1,0 1 0,0-1 0,0 0 1,0 0-1,0 0 0,0 0 0,0 1 1,0-1-1,0-1 0,2 1 1,4 1-293,0-1 1,0 0-1,0 0 1,-1 0-1,13-3 1,-6-1-6542</inkml:trace>
-  <inkml:trace contextRef="#ctx0" brushRef="#br0" timeOffset="1070.67">121 0 24575,'4'9'0,"-1"1"0,0-1 0,0 1 0,-1 0 0,0-1 0,0 1 0,-1 13 0,-2 77 0,-1-47 0,1-14 0,-1-26 0,2 1 0,-1 0 0,2 0 0,0-1 0,0 1 0,2 0 0,0-1 0,0 1 0,8 18 0,-9-27 22,2 1-176,-1 0 0,0 0 0,0 0-1,-1 1 1,0-1 0,0 1 0,-1 0 0,2 12 0,-4-4-6672</inkml:trace>
+  <inkml:trace contextRef="#ctx0" brushRef="#br0" timeOffset="1070.66">121 0 24575,'4'9'0,"-1"1"0,0-1 0,0 1 0,-1 0 0,0-1 0,0 1 0,-1 13 0,-2 77 0,-1-47 0,1-14 0,-1-26 0,2 1 0,-1 0 0,2 0 0,0-1 0,0 1 0,2 0 0,0-1 0,0 1 0,8 18 0,-9-27 22,2 1-176,-1 0 0,0 0 0,0 0-1,-1 1 1,0-1 0,0 1 0,-1 0 0,2 12 0,-4-4-6672</inkml:trace>
 </inkml:ink>
 </file>
 
@@ -4737,6 +4771,12 @@
 </file>
 
 <file path=customXml/item1.xml><?xml version="1.0" encoding="utf-8"?>
+<p:properties xmlns:p="http://schemas.microsoft.com/office/2006/metadata/properties" xmlns:xsi="http://www.w3.org/2001/XMLSchema-instance" xmlns:pc="http://schemas.microsoft.com/office/infopath/2007/PartnerControls">
+  <documentManagement/>
+</p:properties>
+</file>
+
+<file path=customXml/item2.xml><?xml version="1.0" encoding="utf-8"?>
 <?mso-contentType ?>
 <FormTemplates xmlns="http://schemas.microsoft.com/sharepoint/v3/contenttype/forms">
   <Display>DocumentLibraryForm</Display>
@@ -4745,17 +4785,7 @@
 </FormTemplates>
 </file>
 
-<file path=customXml/item2.xml><?xml version="1.0" encoding="utf-8"?>
-<b:Sources xmlns:b="http://schemas.openxmlformats.org/officeDocument/2006/bibliography" xmlns="http://schemas.openxmlformats.org/officeDocument/2006/bibliography" SelectedStyle="\APASixthEditionOfficeOnline.xsl" StyleName="APA" Version="6"/>
-</file>
-
 <file path=customXml/item3.xml><?xml version="1.0" encoding="utf-8"?>
-<p:properties xmlns:p="http://schemas.microsoft.com/office/2006/metadata/properties" xmlns:xsi="http://www.w3.org/2001/XMLSchema-instance" xmlns:pc="http://schemas.microsoft.com/office/infopath/2007/PartnerControls">
-  <documentManagement/>
-</p:properties>
-</file>
-
-<file path=customXml/item4.xml><?xml version="1.0" encoding="utf-8"?>
 <ct:contentTypeSchema xmlns:ct="http://schemas.microsoft.com/office/2006/metadata/contentType" xmlns:ma="http://schemas.microsoft.com/office/2006/metadata/properties/metaAttributes" ct:_="" ma:_="" ma:contentTypeName="Documento" ma:contentTypeID="0x0101009B2FB2BBBEAEC040937751C7A00A74F6" ma:contentTypeVersion="5" ma:contentTypeDescription="Crear nuevo documento." ma:contentTypeScope="" ma:versionID="fb23fc2c01da29b196bd49b82884f59a">
   <xsd:schema xmlns:xsd="http://www.w3.org/2001/XMLSchema" xmlns:xs="http://www.w3.org/2001/XMLSchema" xmlns:p="http://schemas.microsoft.com/office/2006/metadata/properties" xmlns:ns3="7d819208-f668-496f-9658-5f90ad2aff19" targetNamespace="http://schemas.microsoft.com/office/2006/metadata/properties" ma:root="true" ma:fieldsID="f5d13e424029ce43e31cd31c58395a53" ns3:_="">
     <xsd:import namespace="7d819208-f668-496f-9658-5f90ad2aff19"/>
@@ -4905,23 +4935,11 @@
 </ct:contentTypeSchema>
 </file>
 
-<file path=customXml/itemProps1.xml><?xml version="1.0" encoding="utf-8"?>
-<ds:datastoreItem xmlns:ds="http://schemas.openxmlformats.org/officeDocument/2006/customXml" ds:itemID="{B7B6573A-030A-4A4D-AF3A-F81E0C7C5C69}">
-  <ds:schemaRefs>
-    <ds:schemaRef ds:uri="http://schemas.microsoft.com/sharepoint/v3/contenttype/forms"/>
-  </ds:schemaRefs>
-</ds:datastoreItem>
+<file path=customXml/item4.xml><?xml version="1.0" encoding="utf-8"?>
+<b:Sources xmlns:b="http://schemas.openxmlformats.org/officeDocument/2006/bibliography" xmlns="http://schemas.openxmlformats.org/officeDocument/2006/bibliography" SelectedStyle="\APASixthEditionOfficeOnline.xsl" StyleName="APA" Version="6"/>
 </file>
 
-<file path=customXml/itemProps2.xml><?xml version="1.0" encoding="utf-8"?>
-<ds:datastoreItem xmlns:ds="http://schemas.openxmlformats.org/officeDocument/2006/customXml" ds:itemID="{075B79C0-E95D-4260-8AB9-AC480F546828}">
-  <ds:schemaRefs>
-    <ds:schemaRef ds:uri="http://schemas.openxmlformats.org/officeDocument/2006/bibliography"/>
-  </ds:schemaRefs>
-</ds:datastoreItem>
-</file>
-
-<file path=customXml/itemProps3.xml><?xml version="1.0" encoding="utf-8"?>
+<file path=customXml/itemProps1.xml><?xml version="1.0" encoding="utf-8"?>
 <ds:datastoreItem xmlns:ds="http://schemas.openxmlformats.org/officeDocument/2006/customXml" ds:itemID="{AD68DCE7-FF23-46F0-9298-B4D378C744D1}">
   <ds:schemaRefs>
     <ds:schemaRef ds:uri="http://schemas.microsoft.com/office/2006/metadata/properties"/>
@@ -4930,7 +4948,15 @@
 </ds:datastoreItem>
 </file>
 
-<file path=customXml/itemProps4.xml><?xml version="1.0" encoding="utf-8"?>
+<file path=customXml/itemProps2.xml><?xml version="1.0" encoding="utf-8"?>
+<ds:datastoreItem xmlns:ds="http://schemas.openxmlformats.org/officeDocument/2006/customXml" ds:itemID="{B7B6573A-030A-4A4D-AF3A-F81E0C7C5C69}">
+  <ds:schemaRefs>
+    <ds:schemaRef ds:uri="http://schemas.microsoft.com/sharepoint/v3/contenttype/forms"/>
+  </ds:schemaRefs>
+</ds:datastoreItem>
+</file>
+
+<file path=customXml/itemProps3.xml><?xml version="1.0" encoding="utf-8"?>
 <ds:datastoreItem xmlns:ds="http://schemas.openxmlformats.org/officeDocument/2006/customXml" ds:itemID="{A245B10A-792E-401C-BA8D-38A019B1652B}">
   <ds:schemaRefs>
     <ds:schemaRef ds:uri="http://schemas.microsoft.com/office/2006/metadata/contentType"/>
@@ -4946,4 +4972,12 @@
     <ds:schemaRef ds:uri="http://schemas.microsoft.com/internal/obd"/>
   </ds:schemaRefs>
 </ds:datastoreItem>
+</file>
+
+<file path=customXml/itemProps4.xml><?xml version="1.0" encoding="utf-8"?>
+<ds:datastoreItem xmlns:ds="http://schemas.openxmlformats.org/officeDocument/2006/customXml" ds:itemID="{075B79C0-E95D-4260-8AB9-AC480F546828}">
+  <ds:schemaRefs>
+    <ds:schemaRef ds:uri="http://schemas.openxmlformats.org/officeDocument/2006/bibliography"/>
+  </ds:schemaRefs>
+</ds:datastoreItem>
 </file>
</xml_diff>